<commit_message>
Deploy na Vercel: 9 funções (limite de 12 do plano Hobby)
- pacientes, solicitações e usuários com uma função cada; vercel.json
  reescreve as rotas com :id e o código das rotas vai para lib/rotas/
- endereços da API iguais; dev-server segue as mesmas reescritas
- docs e CHANGELOG
</commit_message>
<xml_diff>
--- a/docs/word/03 - Regras de negócio.docx
+++ b/docs/word/03 - Regras de negócio.docx
@@ -5613,9 +5613,9 @@
         <w:tblLayout w:type="fixed"/>
       </w:tblPr>
       <w:tblGrid>
-        <w:gridCol w:w="604"/>
-        <w:gridCol w:w="4877"/>
-        <w:gridCol w:w="4157"/>
+        <w:gridCol w:w="589"/>
+        <w:gridCol w:w="4757"/>
+        <w:gridCol w:w="4291"/>
       </w:tblGrid>
       <w:tr>
         <w:trPr>
@@ -5623,7 +5623,7 @@
         </w:trPr>
         <w:tc>
           <w:tcPr>
-            <w:tcW w:type="dxa" w:w="604"/>
+            <w:tcW w:type="dxa" w:w="589"/>
             <w:shd w:fill="1C1FC8" w:color="auto" w:val="clear"/>
             <w:tcMar>
               <w:top w:type="dxa" w:w="60"/>
@@ -5648,7 +5648,7 @@
         </w:tc>
         <w:tc>
           <w:tcPr>
-            <w:tcW w:type="dxa" w:w="4877"/>
+            <w:tcW w:type="dxa" w:w="4757"/>
             <w:shd w:fill="1C1FC8" w:color="auto" w:val="clear"/>
             <w:tcMar>
               <w:top w:type="dxa" w:w="60"/>
@@ -5673,7 +5673,7 @@
         </w:tc>
         <w:tc>
           <w:tcPr>
-            <w:tcW w:type="dxa" w:w="4157"/>
+            <w:tcW w:type="dxa" w:w="4291"/>
             <w:shd w:fill="1C1FC8" w:color="auto" w:val="clear"/>
             <w:tcMar>
               <w:top w:type="dxa" w:w="60"/>
@@ -5703,7 +5703,7 @@
         </w:trPr>
         <w:tc>
           <w:tcPr>
-            <w:tcW w:type="dxa" w:w="604"/>
+            <w:tcW w:type="dxa" w:w="589"/>
             <w:tcMar>
               <w:top w:type="dxa" w:w="60"/>
               <w:left w:type="dxa" w:w="100"/>
@@ -5722,7 +5722,7 @@
         </w:tc>
         <w:tc>
           <w:tcPr>
-            <w:tcW w:type="dxa" w:w="4877"/>
+            <w:tcW w:type="dxa" w:w="4757"/>
             <w:tcMar>
               <w:top w:type="dxa" w:w="60"/>
               <w:left w:type="dxa" w:w="100"/>
@@ -5751,7 +5751,7 @@
         </w:tc>
         <w:tc>
           <w:tcPr>
-            <w:tcW w:type="dxa" w:w="4157"/>
+            <w:tcW w:type="dxa" w:w="4291"/>
             <w:tcMar>
               <w:top w:type="dxa" w:w="60"/>
               <w:left w:type="dxa" w:w="100"/>
@@ -5795,7 +5795,7 @@
         </w:trPr>
         <w:tc>
           <w:tcPr>
-            <w:tcW w:type="dxa" w:w="604"/>
+            <w:tcW w:type="dxa" w:w="589"/>
             <w:shd w:fill="F6F4FE" w:color="auto" w:val="clear"/>
             <w:tcMar>
               <w:top w:type="dxa" w:w="60"/>
@@ -5815,7 +5815,7 @@
         </w:tc>
         <w:tc>
           <w:tcPr>
-            <w:tcW w:type="dxa" w:w="4877"/>
+            <w:tcW w:type="dxa" w:w="4757"/>
             <w:shd w:fill="F6F4FE" w:color="auto" w:val="clear"/>
             <w:tcMar>
               <w:top w:type="dxa" w:w="60"/>
@@ -5885,7 +5885,7 @@
         </w:tc>
         <w:tc>
           <w:tcPr>
-            <w:tcW w:type="dxa" w:w="4157"/>
+            <w:tcW w:type="dxa" w:w="4291"/>
             <w:shd w:fill="F6F4FE" w:color="auto" w:val="clear"/>
             <w:tcMar>
               <w:top w:type="dxa" w:w="60"/>
@@ -5929,7 +5929,7 @@
         </w:trPr>
         <w:tc>
           <w:tcPr>
-            <w:tcW w:type="dxa" w:w="604"/>
+            <w:tcW w:type="dxa" w:w="589"/>
             <w:tcMar>
               <w:top w:type="dxa" w:w="60"/>
               <w:left w:type="dxa" w:w="100"/>
@@ -5948,7 +5948,7 @@
         </w:tc>
         <w:tc>
           <w:tcPr>
-            <w:tcW w:type="dxa" w:w="4877"/>
+            <w:tcW w:type="dxa" w:w="4757"/>
             <w:tcMar>
               <w:top w:type="dxa" w:w="60"/>
               <w:left w:type="dxa" w:w="100"/>
@@ -5977,7 +5977,7 @@
         </w:tc>
         <w:tc>
           <w:tcPr>
-            <w:tcW w:type="dxa" w:w="4157"/>
+            <w:tcW w:type="dxa" w:w="4291"/>
             <w:tcMar>
               <w:top w:type="dxa" w:w="60"/>
               <w:left w:type="dxa" w:w="100"/>
@@ -6008,7 +6008,7 @@
         </w:trPr>
         <w:tc>
           <w:tcPr>
-            <w:tcW w:type="dxa" w:w="604"/>
+            <w:tcW w:type="dxa" w:w="589"/>
             <w:shd w:fill="F6F4FE" w:color="auto" w:val="clear"/>
             <w:tcMar>
               <w:top w:type="dxa" w:w="60"/>
@@ -6028,7 +6028,7 @@
         </w:tc>
         <w:tc>
           <w:tcPr>
-            <w:tcW w:type="dxa" w:w="4877"/>
+            <w:tcW w:type="dxa" w:w="4757"/>
             <w:shd w:fill="F6F4FE" w:color="auto" w:val="clear"/>
             <w:tcMar>
               <w:top w:type="dxa" w:w="60"/>
@@ -6058,7 +6058,7 @@
         </w:tc>
         <w:tc>
           <w:tcPr>
-            <w:tcW w:type="dxa" w:w="4157"/>
+            <w:tcW w:type="dxa" w:w="4291"/>
             <w:shd w:fill="F6F4FE" w:color="auto" w:val="clear"/>
             <w:tcMar>
               <w:top w:type="dxa" w:w="60"/>
@@ -6103,7 +6103,7 @@
         </w:trPr>
         <w:tc>
           <w:tcPr>
-            <w:tcW w:type="dxa" w:w="604"/>
+            <w:tcW w:type="dxa" w:w="589"/>
             <w:tcMar>
               <w:top w:type="dxa" w:w="60"/>
               <w:left w:type="dxa" w:w="100"/>
@@ -6122,7 +6122,7 @@
         </w:tc>
         <w:tc>
           <w:tcPr>
-            <w:tcW w:type="dxa" w:w="4877"/>
+            <w:tcW w:type="dxa" w:w="4757"/>
             <w:tcMar>
               <w:top w:type="dxa" w:w="60"/>
               <w:left w:type="dxa" w:w="100"/>
@@ -6171,7 +6171,7 @@
         </w:tc>
         <w:tc>
           <w:tcPr>
-            <w:tcW w:type="dxa" w:w="4157"/>
+            <w:tcW w:type="dxa" w:w="4291"/>
             <w:tcMar>
               <w:top w:type="dxa" w:w="60"/>
               <w:left w:type="dxa" w:w="100"/>
@@ -6214,7 +6214,7 @@
         </w:trPr>
         <w:tc>
           <w:tcPr>
-            <w:tcW w:type="dxa" w:w="604"/>
+            <w:tcW w:type="dxa" w:w="589"/>
             <w:shd w:fill="F6F4FE" w:color="auto" w:val="clear"/>
             <w:tcMar>
               <w:top w:type="dxa" w:w="60"/>
@@ -6234,7 +6234,7 @@
         </w:tc>
         <w:tc>
           <w:tcPr>
-            <w:tcW w:type="dxa" w:w="4877"/>
+            <w:tcW w:type="dxa" w:w="4757"/>
             <w:shd w:fill="F6F4FE" w:color="auto" w:val="clear"/>
             <w:tcMar>
               <w:top w:type="dxa" w:w="60"/>
@@ -6288,7 +6288,7 @@
         </w:tc>
         <w:tc>
           <w:tcPr>
-            <w:tcW w:type="dxa" w:w="4157"/>
+            <w:tcW w:type="dxa" w:w="4291"/>
             <w:shd w:fill="F6F4FE" w:color="auto" w:val="clear"/>
             <w:tcMar>
               <w:top w:type="dxa" w:w="60"/>
@@ -6342,7 +6342,7 @@
         </w:trPr>
         <w:tc>
           <w:tcPr>
-            <w:tcW w:type="dxa" w:w="604"/>
+            <w:tcW w:type="dxa" w:w="589"/>
             <w:tcMar>
               <w:top w:type="dxa" w:w="60"/>
               <w:left w:type="dxa" w:w="100"/>
@@ -6361,7 +6361,7 @@
         </w:tc>
         <w:tc>
           <w:tcPr>
-            <w:tcW w:type="dxa" w:w="4877"/>
+            <w:tcW w:type="dxa" w:w="4757"/>
             <w:tcMar>
               <w:top w:type="dxa" w:w="60"/>
               <w:left w:type="dxa" w:w="100"/>
@@ -6407,7 +6407,7 @@
         </w:tc>
         <w:tc>
           <w:tcPr>
-            <w:tcW w:type="dxa" w:w="4157"/>
+            <w:tcW w:type="dxa" w:w="4291"/>
             <w:tcMar>
               <w:top w:type="dxa" w:w="60"/>
               <w:left w:type="dxa" w:w="100"/>
@@ -6451,7 +6451,7 @@
         </w:trPr>
         <w:tc>
           <w:tcPr>
-            <w:tcW w:type="dxa" w:w="604"/>
+            <w:tcW w:type="dxa" w:w="589"/>
             <w:shd w:fill="F6F4FE" w:color="auto" w:val="clear"/>
             <w:tcMar>
               <w:top w:type="dxa" w:w="60"/>
@@ -6471,7 +6471,7 @@
         </w:tc>
         <w:tc>
           <w:tcPr>
-            <w:tcW w:type="dxa" w:w="4877"/>
+            <w:tcW w:type="dxa" w:w="4757"/>
             <w:shd w:fill="F6F4FE" w:color="auto" w:val="clear"/>
             <w:tcMar>
               <w:top w:type="dxa" w:w="60"/>
@@ -6508,7 +6508,7 @@
         </w:tc>
         <w:tc>
           <w:tcPr>
-            <w:tcW w:type="dxa" w:w="4157"/>
+            <w:tcW w:type="dxa" w:w="4291"/>
             <w:shd w:fill="F6F4FE" w:color="auto" w:val="clear"/>
             <w:tcMar>
               <w:top w:type="dxa" w:w="60"/>
@@ -6546,7 +6546,7 @@
         </w:trPr>
         <w:tc>
           <w:tcPr>
-            <w:tcW w:type="dxa" w:w="604"/>
+            <w:tcW w:type="dxa" w:w="589"/>
             <w:tcMar>
               <w:top w:type="dxa" w:w="60"/>
               <w:left w:type="dxa" w:w="100"/>
@@ -6565,7 +6565,7 @@
         </w:tc>
         <w:tc>
           <w:tcPr>
-            <w:tcW w:type="dxa" w:w="4877"/>
+            <w:tcW w:type="dxa" w:w="4757"/>
             <w:tcMar>
               <w:top w:type="dxa" w:w="60"/>
               <w:left w:type="dxa" w:w="100"/>
@@ -6594,7 +6594,7 @@
         </w:tc>
         <w:tc>
           <w:tcPr>
-            <w:tcW w:type="dxa" w:w="4157"/>
+            <w:tcW w:type="dxa" w:w="4291"/>
             <w:tcMar>
               <w:top w:type="dxa" w:w="60"/>
               <w:left w:type="dxa" w:w="100"/>
@@ -6625,7 +6625,7 @@
         </w:trPr>
         <w:tc>
           <w:tcPr>
-            <w:tcW w:type="dxa" w:w="604"/>
+            <w:tcW w:type="dxa" w:w="589"/>
             <w:shd w:fill="F6F4FE" w:color="auto" w:val="clear"/>
             <w:tcMar>
               <w:top w:type="dxa" w:w="60"/>
@@ -6645,7 +6645,7 @@
         </w:tc>
         <w:tc>
           <w:tcPr>
-            <w:tcW w:type="dxa" w:w="4877"/>
+            <w:tcW w:type="dxa" w:w="4757"/>
             <w:shd w:fill="F6F4FE" w:color="auto" w:val="clear"/>
             <w:tcMar>
               <w:top w:type="dxa" w:w="60"/>
@@ -6675,7 +6675,7 @@
         </w:tc>
         <w:tc>
           <w:tcPr>
-            <w:tcW w:type="dxa" w:w="4157"/>
+            <w:tcW w:type="dxa" w:w="4291"/>
             <w:shd w:fill="F6F4FE" w:color="auto" w:val="clear"/>
             <w:tcMar>
               <w:top w:type="dxa" w:w="60"/>
@@ -6700,7 +6700,7 @@
         </w:trPr>
         <w:tc>
           <w:tcPr>
-            <w:tcW w:type="dxa" w:w="604"/>
+            <w:tcW w:type="dxa" w:w="589"/>
             <w:tcMar>
               <w:top w:type="dxa" w:w="60"/>
               <w:left w:type="dxa" w:w="100"/>
@@ -6719,7 +6719,7 @@
         </w:tc>
         <w:tc>
           <w:tcPr>
-            <w:tcW w:type="dxa" w:w="4877"/>
+            <w:tcW w:type="dxa" w:w="4757"/>
             <w:tcMar>
               <w:top w:type="dxa" w:w="60"/>
               <w:left w:type="dxa" w:w="100"/>
@@ -6765,27 +6765,27 @@
         </w:tc>
         <w:tc>
           <w:tcPr>
-            <w:tcW w:type="dxa" w:w="4157"/>
-            <w:tcMar>
-              <w:top w:type="dxa" w:w="60"/>
-              <w:left w:type="dxa" w:w="100"/>
-              <w:bottom w:type="dxa" w:w="60"/>
-              <w:right w:type="dxa" w:w="100"/>
-            </w:tcMar>
-          </w:tcPr>
-          <w:p>
-            <w:pPr>
-              <w:spacing w:after="40" w:before="40"/>
-            </w:pPr>
-            <w:r>
-              <w:rPr>
-                <w:rFonts w:ascii="Consolas" w:cs="Consolas" w:eastAsia="Consolas" w:hAnsi="Consolas"/>
-                <w:color w:val="6A1BBF"/>
-                <w:sz w:val="18"/>
-                <w:szCs w:val="18"/>
-                <w:shd w:fill="F1ECFB" w:color="auto" w:val="clear"/>
-              </w:rPr>
-              <w:t xml:space="preserve">api/usuarios/[login].js</w:t>
+            <w:tcW w:type="dxa" w:w="4291"/>
+            <w:tcMar>
+              <w:top w:type="dxa" w:w="60"/>
+              <w:left w:type="dxa" w:w="100"/>
+              <w:bottom w:type="dxa" w:w="60"/>
+              <w:right w:type="dxa" w:w="100"/>
+            </w:tcMar>
+          </w:tcPr>
+          <w:p>
+            <w:pPr>
+              <w:spacing w:after="40" w:before="40"/>
+            </w:pPr>
+            <w:r>
+              <w:rPr>
+                <w:rFonts w:ascii="Consolas" w:cs="Consolas" w:eastAsia="Consolas" w:hAnsi="Consolas"/>
+                <w:color w:val="6A1BBF"/>
+                <w:sz w:val="18"/>
+                <w:szCs w:val="18"/>
+                <w:shd w:fill="F1ECFB" w:color="auto" w:val="clear"/>
+              </w:rPr>
+              <w:t xml:space="preserve">lib/rotas/usuario-alterar.js</w:t>
             </w:r>
             <w:r>
               <w:t xml:space="preserve">, workflow Usuários (</w:t>
@@ -6812,7 +6812,7 @@
         </w:trPr>
         <w:tc>
           <w:tcPr>
-            <w:tcW w:type="dxa" w:w="604"/>
+            <w:tcW w:type="dxa" w:w="589"/>
             <w:shd w:fill="F6F4FE" w:color="auto" w:val="clear"/>
             <w:tcMar>
               <w:top w:type="dxa" w:w="60"/>
@@ -6832,7 +6832,7 @@
         </w:tc>
         <w:tc>
           <w:tcPr>
-            <w:tcW w:type="dxa" w:w="4877"/>
+            <w:tcW w:type="dxa" w:w="4757"/>
             <w:shd w:fill="F6F4FE" w:color="auto" w:val="clear"/>
             <w:tcMar>
               <w:top w:type="dxa" w:w="60"/>
@@ -6862,7 +6862,7 @@
         </w:tc>
         <w:tc>
           <w:tcPr>
-            <w:tcW w:type="dxa" w:w="4157"/>
+            <w:tcW w:type="dxa" w:w="4291"/>
             <w:shd w:fill="F6F4FE" w:color="auto" w:val="clear"/>
             <w:tcMar>
               <w:top w:type="dxa" w:w="60"/>
@@ -6907,7 +6907,7 @@
         </w:trPr>
         <w:tc>
           <w:tcPr>
-            <w:tcW w:type="dxa" w:w="604"/>
+            <w:tcW w:type="dxa" w:w="589"/>
             <w:tcMar>
               <w:top w:type="dxa" w:w="60"/>
               <w:left w:type="dxa" w:w="100"/>
@@ -6926,7 +6926,7 @@
         </w:tc>
         <w:tc>
           <w:tcPr>
-            <w:tcW w:type="dxa" w:w="4877"/>
+            <w:tcW w:type="dxa" w:w="4757"/>
             <w:tcMar>
               <w:top w:type="dxa" w:w="60"/>
               <w:left w:type="dxa" w:w="100"/>
@@ -6965,7 +6965,7 @@
         </w:tc>
         <w:tc>
           <w:tcPr>
-            <w:tcW w:type="dxa" w:w="4157"/>
+            <w:tcW w:type="dxa" w:w="4291"/>
             <w:tcMar>
               <w:top w:type="dxa" w:w="60"/>
               <w:left w:type="dxa" w:w="100"/>
@@ -9066,7 +9066,7 @@
                 <w:szCs w:val="18"/>
                 <w:shd w:fill="F1ECFB" w:color="auto" w:val="clear"/>
               </w:rPr>
-              <w:t xml:space="preserve">api/solicitacoes/[id].js</w:t>
+              <w:t xml:space="preserve">lib/rotas/solicitacao-decidir.js</w:t>
             </w:r>
             <w:r>
               <w:t xml:space="preserve">; </w:t>
@@ -9188,7 +9188,7 @@
                 <w:szCs w:val="18"/>
                 <w:shd w:fill="F1ECFB" w:color="auto" w:val="clear"/>
               </w:rPr>
-              <w:t xml:space="preserve">api/solicitacoes/[id]/liberar.js</w:t>
+              <w:t xml:space="preserve">lib/rotas/solicitacao-liberar.js</w:t>
             </w:r>
             <w:r>
               <w:t xml:space="preserve">; </w:t>

</xml_diff>